<commit_message>
GLOB-648: Fixes to settlement claims documents
</commit_message>
<xml_diff>
--- a/Reportes/finiquito desistimiento.docx
+++ b/Reportes/finiquito desistimiento.docx
@@ -159,6 +159,7 @@
         <w:t>{</w:t>
       </w:r>
       <w:proofErr w:type="spellStart"/>
+      <w:proofErr w:type="gramStart"/>
       <w:r>
         <w:rPr>
           <w:b/>
@@ -174,6 +175,7 @@
         <w:t>beneficiario</w:t>
       </w:r>
       <w:proofErr w:type="spellEnd"/>
+      <w:proofErr w:type="gramEnd"/>
       <w:r>
         <w:rPr>
           <w:b/>
@@ -211,6 +213,7 @@
         <w:t>{</w:t>
       </w:r>
       <w:proofErr w:type="spellStart"/>
+      <w:proofErr w:type="gramStart"/>
       <w:r>
         <w:rPr>
           <w:b/>
@@ -235,6 +238,7 @@
         <w:t>beneficiario</w:t>
       </w:r>
       <w:proofErr w:type="spellEnd"/>
+      <w:proofErr w:type="gramEnd"/>
       <w:r>
         <w:rPr>
           <w:b/>
@@ -814,6 +818,7 @@
         <w:t>{</w:t>
       </w:r>
       <w:proofErr w:type="spellStart"/>
+      <w:proofErr w:type="gramStart"/>
       <w:r>
         <w:rPr>
           <w:b/>
@@ -831,6 +836,7 @@
         <w:t>asegurado</w:t>
       </w:r>
       <w:proofErr w:type="spellEnd"/>
+      <w:proofErr w:type="gramEnd"/>
       <w:r>
         <w:rPr>
           <w:b/>
@@ -866,7 +872,15 @@
           <w:sz w:val="20"/>
           <w:szCs w:val="20"/>
         </w:rPr>
-        <w:t xml:space="preserve">Reclamo:    </w:t>
+        <w:t xml:space="preserve">Reclamo: </w:t>
+      </w:r>
+      <w:proofErr w:type="gramStart"/>
+      <w:r>
+        <w:rPr>
+          <w:sz w:val="20"/>
+          <w:szCs w:val="20"/>
+        </w:rPr>
+        <w:t xml:space="preserve">   </w:t>
       </w:r>
       <w:r>
         <w:rPr>
@@ -878,6 +892,7 @@
         <w:t>{</w:t>
       </w:r>
       <w:proofErr w:type="spellStart"/>
+      <w:proofErr w:type="gramEnd"/>
       <w:r>
         <w:rPr>
           <w:b/>
@@ -950,6 +965,7 @@
         <w:t>{</w:t>
       </w:r>
       <w:proofErr w:type="spellStart"/>
+      <w:proofErr w:type="gramStart"/>
       <w:r>
         <w:rPr>
           <w:b/>
@@ -964,18 +980,10 @@
           <w:szCs w:val="20"/>
           <w:u w:val="single"/>
         </w:rPr>
-        <w:t>cheque</w:t>
-      </w:r>
-      <w:r>
-        <w:rPr>
-          <w:b/>
-          <w:sz w:val="20"/>
-          <w:szCs w:val="20"/>
-          <w:u w:val="single"/>
-        </w:rPr>
-        <w:t>hotel</w:t>
+        <w:t>chequetotal</w:t>
       </w:r>
       <w:proofErr w:type="spellEnd"/>
+      <w:proofErr w:type="gramEnd"/>
       <w:r>
         <w:rPr>
           <w:b/>
@@ -1136,6 +1144,7 @@
     <w:lsdException w:name="HTML Sample" w:semiHidden="1" w:unhideWhenUsed="1"/>
     <w:lsdException w:name="HTML Typewriter" w:semiHidden="1" w:unhideWhenUsed="1"/>
     <w:lsdException w:name="HTML Variable" w:semiHidden="1" w:unhideWhenUsed="1"/>
+    <w:lsdException w:name="Normal Table" w:semiHidden="1" w:unhideWhenUsed="1"/>
     <w:lsdException w:name="annotation subject" w:semiHidden="1" w:unhideWhenUsed="1"/>
     <w:lsdException w:name="No List" w:semiHidden="1" w:unhideWhenUsed="1"/>
     <w:lsdException w:name="Outline List 1" w:semiHidden="1" w:unhideWhenUsed="1"/>
@@ -1178,8 +1187,11 @@
     <w:lsdException w:name="Table Contemporary" w:semiHidden="1" w:unhideWhenUsed="1"/>
     <w:lsdException w:name="Table Elegant" w:semiHidden="1" w:unhideWhenUsed="1"/>
     <w:lsdException w:name="Table Professional" w:semiHidden="1" w:unhideWhenUsed="1"/>
+    <w:lsdException w:name="Table Subtle 1" w:semiHidden="1" w:unhideWhenUsed="1"/>
     <w:lsdException w:name="Table Subtle 2" w:semiHidden="1" w:unhideWhenUsed="1"/>
     <w:lsdException w:name="Table Web 1" w:semiHidden="1" w:unhideWhenUsed="1"/>
+    <w:lsdException w:name="Table Web 2" w:semiHidden="1" w:unhideWhenUsed="1"/>
+    <w:lsdException w:name="Table Web 3" w:semiHidden="1" w:unhideWhenUsed="1"/>
     <w:lsdException w:name="Balloon Text" w:semiHidden="1" w:unhideWhenUsed="1"/>
     <w:lsdException w:name="Table Grid" w:uiPriority="39"/>
     <w:lsdException w:name="Table Theme" w:semiHidden="1" w:unhideWhenUsed="1"/>

</xml_diff>